<commit_message>
fix handleFindJobs in page.tsx
</commit_message>
<xml_diff>
--- a/Documentation/backend docs/app.core.config.docx
+++ b/Documentation/backend docs/app.core.config.docx
@@ -68,6 +68,7 @@
     </w:p>
     <w:p>
       <w:pPr>
+        <w:ind w:left="720"/>
         <w:rPr>
           <w:sz w:val="24"/>
           <w:szCs w:val="24"/>
@@ -83,26 +84,42 @@
     </w:p>
     <w:p>
       <w:pPr>
-        <w:rPr>
-          <w:sz w:val="24"/>
-          <w:szCs w:val="24"/>
-        </w:rPr>
-      </w:pPr>
-      <w:r>
-        <w:rPr>
-          <w:sz w:val="24"/>
-          <w:szCs w:val="24"/>
-        </w:rPr>
-        <w:t>environment variables</w:t>
-      </w:r>
-    </w:p>
-    <w:p>
-      <w:pPr>
-        <w:rPr>
-          <w:sz w:val="24"/>
-          <w:szCs w:val="24"/>
-        </w:rPr>
-      </w:pPr>
+        <w:ind w:left="720"/>
+        <w:rPr>
+          <w:sz w:val="24"/>
+          <w:szCs w:val="24"/>
+        </w:rPr>
+      </w:pPr>
+      <w:r>
+        <w:rPr>
+          <w:sz w:val="24"/>
+          <w:szCs w:val="24"/>
+        </w:rPr>
+        <w:t xml:space="preserve">environment </w:t>
+      </w:r>
+      <w:proofErr w:type="gramStart"/>
+      <w:r>
+        <w:rPr>
+          <w:sz w:val="24"/>
+          <w:szCs w:val="24"/>
+        </w:rPr>
+        <w:t>variables</w:t>
+      </w:r>
+      <w:r>
+        <w:rPr>
+          <w:sz w:val="24"/>
+          <w:szCs w:val="24"/>
+        </w:rPr>
+        <w:t xml:space="preserve"> :</w:t>
+      </w:r>
+      <w:proofErr w:type="gramEnd"/>
+      <w:r>
+        <w:rPr>
+          <w:sz w:val="24"/>
+          <w:szCs w:val="24"/>
+        </w:rPr>
+        <w:t xml:space="preserve"> </w:t>
+      </w:r>
       <w:r>
         <w:rPr>
           <w:sz w:val="24"/>
@@ -128,6 +145,7 @@
     </w:p>
     <w:p>
       <w:pPr>
+        <w:ind w:firstLine="720"/>
         <w:rPr>
           <w:sz w:val="24"/>
           <w:szCs w:val="24"/>
@@ -198,6 +216,7 @@
     </w:p>
     <w:p>
       <w:pPr>
+        <w:ind w:left="720"/>
         <w:rPr>
           <w:sz w:val="24"/>
           <w:szCs w:val="24"/>
@@ -253,6 +272,7 @@
     </w:p>
     <w:p>
       <w:pPr>
+        <w:ind w:firstLine="720"/>
         <w:rPr>
           <w:sz w:val="24"/>
           <w:szCs w:val="24"/>
@@ -279,6 +299,7 @@
     </w:p>
     <w:p>
       <w:pPr>
+        <w:ind w:firstLine="720"/>
         <w:rPr>
           <w:sz w:val="24"/>
           <w:szCs w:val="24"/>
@@ -305,6 +326,7 @@
     </w:p>
     <w:p>
       <w:pPr>
+        <w:ind w:firstLine="720"/>
         <w:rPr>
           <w:sz w:val="24"/>
           <w:szCs w:val="24"/>
@@ -616,22 +638,22 @@
           <w:sz w:val="24"/>
           <w:szCs w:val="24"/>
         </w:rPr>
+        <w:t>EMBEDDING_MODEL: str = "all-MiniLM-L6-v2"</w:t>
+      </w:r>
+    </w:p>
+    <w:p>
+      <w:pPr>
+        <w:rPr>
+          <w:sz w:val="24"/>
+          <w:szCs w:val="24"/>
+        </w:rPr>
+      </w:pPr>
+      <w:r>
+        <w:rPr>
+          <w:sz w:val="24"/>
+          <w:szCs w:val="24"/>
+        </w:rPr>
         <w:lastRenderedPageBreak/>
-        <w:t>EMBEDDING_MODEL: str = "all-MiniLM-L6-v2"</w:t>
-      </w:r>
-    </w:p>
-    <w:p>
-      <w:pPr>
-        <w:rPr>
-          <w:sz w:val="24"/>
-          <w:szCs w:val="24"/>
-        </w:rPr>
-      </w:pPr>
-      <w:r>
-        <w:rPr>
-          <w:sz w:val="24"/>
-          <w:szCs w:val="24"/>
-        </w:rPr>
         <w:t>This model turns resume chunks and search queries into vectors.</w:t>
       </w:r>
     </w:p>
@@ -1228,22 +1250,22 @@
           <w:sz w:val="24"/>
           <w:szCs w:val="24"/>
         </w:rPr>
+        <w:t>will become:</w:t>
+      </w:r>
+    </w:p>
+    <w:p>
+      <w:pPr>
+        <w:rPr>
+          <w:sz w:val="24"/>
+          <w:szCs w:val="24"/>
+        </w:rPr>
+      </w:pPr>
+      <w:r>
+        <w:rPr>
+          <w:sz w:val="24"/>
+          <w:szCs w:val="24"/>
+        </w:rPr>
         <w:lastRenderedPageBreak/>
-        <w:t>will become:</w:t>
-      </w:r>
-    </w:p>
-    <w:p>
-      <w:pPr>
-        <w:rPr>
-          <w:sz w:val="24"/>
-          <w:szCs w:val="24"/>
-        </w:rPr>
-      </w:pPr>
-      <w:r>
-        <w:rPr>
-          <w:sz w:val="24"/>
-          <w:szCs w:val="24"/>
-        </w:rPr>
         <w:t>abc123</w:t>
       </w:r>
     </w:p>
@@ -1878,6 +1900,7 @@
           <w:sz w:val="24"/>
           <w:szCs w:val="24"/>
         </w:rPr>
+        <w:lastRenderedPageBreak/>
         <w:t>Vector size mismatch</w:t>
       </w:r>
     </w:p>
@@ -2563,6 +2586,7 @@
   <w:style w:type="character" w:default="1" w:styleId="DefaultParagraphFont">
     <w:name w:val="Default Paragraph Font"/>
     <w:uiPriority w:val="1"/>
+    <w:semiHidden/>
     <w:unhideWhenUsed/>
   </w:style>
   <w:style w:type="table" w:default="1" w:styleId="TableNormal">

</xml_diff>